<commit_message>
fix(dispatcher): draw in-transit incidents and driver transfers inside the In Transit card
</commit_message>
<xml_diff>
--- a/docs/iteration4/FreightProof_Iteration4_Speaking_Script_v4.docx
+++ b/docs/iteration4/FreightProof_Iteration4_Speaking_Script_v4.docx
@@ -391,7 +391,7 @@
                 <w:sz w:val="22"/>
                 <w:szCs w:val="22"/>
               </w:rPr>
-              <w:t>0:00 to 3:35</w:t>
+              <w:t>0:00 to 3:50</w:t>
             </w:r>
           </w:p>
         </w:tc>
@@ -423,7 +423,7 @@
                 <w:sz w:val="22"/>
                 <w:szCs w:val="22"/>
               </w:rPr>
-              <w:t>3:35</w:t>
+              <w:t>3:50</w:t>
             </w:r>
           </w:p>
         </w:tc>
@@ -557,7 +557,7 @@
                 <w:sz w:val="22"/>
                 <w:szCs w:val="22"/>
               </w:rPr>
-              <w:t>3:35 to 7:10</w:t>
+              <w:t>3:50 to 7:20</w:t>
             </w:r>
           </w:p>
         </w:tc>
@@ -589,7 +589,7 @@
                 <w:sz w:val="22"/>
                 <w:szCs w:val="22"/>
               </w:rPr>
-              <w:t>3:35</w:t>
+              <w:t>3:30</w:t>
             </w:r>
           </w:p>
         </w:tc>
@@ -723,7 +723,7 @@
                 <w:sz w:val="22"/>
                 <w:szCs w:val="22"/>
               </w:rPr>
-              <w:t>7:10 to 11:20</w:t>
+              <w:t>7:20 to 11:20</w:t>
             </w:r>
           </w:p>
         </w:tc>
@@ -755,7 +755,7 @@
                 <w:sz w:val="22"/>
                 <w:szCs w:val="22"/>
               </w:rPr>
-              <w:t>4:10</w:t>
+              <w:t>4:00</w:t>
             </w:r>
           </w:p>
         </w:tc>
@@ -1712,7 +1712,7 @@
         <w:rPr>
           <w:sz w:val="30"/>
         </w:rPr>
-        <w:t>Slide 3: How FreightProof works (1:25)  |  Tim</w:t>
+        <w:t>Slide 3: How FreightProof works (1:40)  |  Tim</w:t>
       </w:r>
     </w:p>
     <w:p>
@@ -1737,7 +1737,7 @@
           <w:sz w:val="24"/>
           <w:szCs w:val="24"/>
         </w:rPr>
-        <w:t>FreightProof brings those records into one trip. Five steps: plan, capture, check, anchor and prove. The dispatcher imports the manifest and locks the plan before the truck moves. The driver's phone captures the evidence required at each phase: photos, seals, counts, time and position. We compare the available evidence with tracker positions, the yard boundary and expected cargo; discrepancies are flagged for review. At delivery, the receiver confirms on their own phone through a single-use link, so the driver cannot simply sign on their behalf.</w:t>
+        <w:t>Five steps: plan, capture, check, anchor and prove. The dispatcher imports the manifest and locks the trip plan. The driver captures evidence at each phase. We compare it with planned cargo and available tracker positions, flagging discrepancies for review. At delivery, the receiver confirms on their own phone through a single-use link. Then the insurer needs to verify what was recorded.</w:t>
       </w:r>
     </w:p>
     <w:p>
@@ -1750,7 +1750,7 @@
           <w:sz w:val="24"/>
           <w:szCs w:val="24"/>
         </w:rPr>
-        <w:t>A fingerprint is a short digital value calculated from a record: change the record and its fingerprint changes. We publish fingerprints to Hedera, a public ledger that gives them an independent timestamp; personal data stays off-chain. The insurer checks the audit pack against those fingerprints. This reveals changes since anchoring. It cannot prove that everything originally reported was true, and it does not prevent a hijacking.</w:t>
+        <w:t>A fingerprint is calculated from a record and changes if the record changes. If both lived only in our database, someone with sufficient access could replace both. Hedera keeps an independently timestamped reference outside our control. Each successfully anchored phase can be checked through the audit pack against that reference. When issued, the pack gets its own seal covering the report data and PDF fingerprints. The insurer therefore checks both the phase records and the exact document received, using their browser to read Hedera directly. Personal data stays off-chain. This proves integrity and timing, not that the original report was true, and it does not prevent hijacking.</w:t>
       </w:r>
     </w:p>
     <w:p>
@@ -1799,7 +1799,7 @@
         <w:rPr>
           <w:sz w:val="24"/>
         </w:rPr>
-        <w:t>Define a fingerprint; Hedera timestamps it independently while personal data stays off-chain.</w:t>
+        <w:t>Explain why a fingerprint in our own database is insufficient; Hedera keeps an independent timestamped reference.</w:t>
       </w:r>
     </w:p>
     <w:p>
@@ -1811,7 +1811,7 @@
         <w:rPr>
           <w:sz w:val="24"/>
         </w:rPr>
-        <w:t>Insurer checks the audit pack independently.</w:t>
+        <w:t>Distinguish phase-record verification from the separate seal on the issued report and PDF; personal data stays off-chain.</w:t>
       </w:r>
     </w:p>
     <w:p>
@@ -1823,7 +1823,7 @@
         <w:rPr>
           <w:sz w:val="24"/>
         </w:rPr>
-        <w:t>Anchoring detects later changes; it does not establish original truth or prevent hijacking.</w:t>
+        <w:t>A phase check needs a successful receipt. A pack seal protects the issued snapshot but does not prove the earlier history or truth of recorded-only items.</w:t>
       </w:r>
     </w:p>
     <w:p>
@@ -1849,19 +1849,19 @@
           <w:b/>
           <w:sz w:val="26"/>
         </w:rPr>
-        <w:t>Plan → capture → check → anchor → prove · Receiver’s own phone → Fingerprint changes with record → Hedera timestamp → Changes detected; original truth not guaranteed</w:t>
-      </w:r>
-    </w:p>
-    <w:p>
-      <w:pPr>
-        <w:pStyle w:val="Normal"/>
-        <w:spacing w:after="100"/>
-      </w:pPr>
-      <w:r>
-        <w:rPr>
-          <w:sz w:val="24"/>
-        </w:rPr>
-        <w:t>Point at  Follow the five steps, finishing at the insurer.</w:t>
+        <w:t>Plan / capture / check → Receiver’s phone → Database could change both → Hedera outside our control → Phase check + pack seal → Integrity and timing; not original truth</w:t>
+      </w:r>
+    </w:p>
+    <w:p>
+      <w:pPr>
+        <w:pStyle w:val="Normal"/>
+        <w:spacing w:after="100"/>
+      </w:pPr>
+      <w:r>
+        <w:rPr>
+          <w:sz w:val="24"/>
+        </w:rPr>
+        <w:t>Point at  Anchor: independent reference. Prove: phase records and the issued pack.</w:t>
       </w:r>
     </w:p>
     <w:p>
@@ -2201,7 +2201,7 @@
         <w:rPr>
           <w:sz w:val="30"/>
         </w:rPr>
-        <w:t>Slide 6: User story map (0:55)  |  Chiko</w:t>
+        <w:t>Slide 6: User story map (0:50)  |  Chiko</w:t>
       </w:r>
     </w:p>
     <w:p>
@@ -2890,7 +2890,7 @@
         <w:rPr>
           <w:sz w:val="30"/>
         </w:rPr>
-        <w:t>Slide 10: Package diagram (0:40)  |  Thomas</w:t>
+        <w:t>Slide 10: Package diagram (0:30)  |  Thomas</w:t>
       </w:r>
     </w:p>
     <w:p>
@@ -4105,7 +4105,7 @@
           <w:sz w:val="24"/>
           <w:szCs w:val="24"/>
         </w:rPr>
-        <w:t>That's the talk. Next is a two-minute recorded walkthrough of a normal trip, made with sample data. Then the live system: one trip through a bad day, ending with an insurer showing that an edited copy of the evidence fails the check.</w:t>
+        <w:t>Next is a two-minute recorded normal trip using sample data. Then the live bad day, ending with two checks: a phase record against Hedera, then the genuine PDF passing and an edited copy failing.</w:t>
       </w:r>
     </w:p>
     <w:p>
@@ -4142,7 +4142,7 @@
         <w:rPr>
           <w:sz w:val="24"/>
         </w:rPr>
-        <w:t>Live demonstration follows one trip through a bad day.</w:t>
+        <w:t>Live demonstration follows a bad day and ends by verifying one successfully anchored phase against Hedera.</w:t>
       </w:r>
     </w:p>
     <w:p>
@@ -4154,7 +4154,7 @@
         <w:rPr>
           <w:sz w:val="24"/>
         </w:rPr>
-        <w:t>Finish with genuine PDF passing and edited PDF failing.</w:t>
+        <w:t>Then verify the pack seal and compare genuine and edited PDFs, explaining that file integrity differs from truth of the report.</w:t>
       </w:r>
     </w:p>
     <w:p>
@@ -4180,7 +4180,7 @@
           <w:b/>
           <w:sz w:val="26"/>
         </w:rPr>
-        <w:t>Normal trip film → Live bad day → Genuine passes → edited fails</w:t>
+        <w:t>Normal trip film → Live bad day → Phase vs Hedera → Pack seal → Genuine PDF passes / edited fails</w:t>
       </w:r>
     </w:p>
     <w:p>
@@ -4483,7 +4483,7 @@
         <w:rPr>
           <w:sz w:val="30"/>
         </w:rPr>
-        <w:t>Slide 3: How FreightProof works (1:25)</w:t>
+        <w:t>Slide 3: How FreightProof works (1:40)</w:t>
       </w:r>
     </w:p>
     <w:p>
@@ -4497,7 +4497,7 @@
           <w:b/>
           <w:sz w:val="26"/>
         </w:rPr>
-        <w:t>Plan → capture → check → anchor → prove · Receiver’s own phone → Fingerprint changes with record → Hedera timestamp → Changes detected; original truth not guaranteed</w:t>
+        <w:t>Plan / capture / check → Receiver’s phone → Database could change both → Hedera outside our control → Phase check + pack seal → Integrity and timing; not original truth</w:t>
       </w:r>
     </w:p>
     <w:p>
@@ -4510,7 +4510,7 @@
         <w:rPr>
           <w:sz w:val="24"/>
         </w:rPr>
-        <w:t>Point at  Follow the five steps, finishing at the insurer.</w:t>
+        <w:t>Point at  Anchor: independent reference. Prove: phase records and the issued pack.</w:t>
       </w:r>
     </w:p>
     <w:p>
@@ -4643,7 +4643,7 @@
         <w:rPr>
           <w:sz w:val="30"/>
         </w:rPr>
-        <w:t>Slide 6: User story map (0:55)</w:t>
+        <w:t>Slide 6: User story map (0:50)</w:t>
       </w:r>
     </w:p>
     <w:p>
@@ -4857,7 +4857,7 @@
         <w:rPr>
           <w:sz w:val="30"/>
         </w:rPr>
-        <w:t>Slide 10: Package diagram (0:40)</w:t>
+        <w:t>Slide 10: Package diagram (0:30)</w:t>
       </w:r>
     </w:p>
     <w:p>
@@ -5246,7 +5246,7 @@
           <w:b/>
           <w:sz w:val="26"/>
         </w:rPr>
-        <w:t>Normal trip film → Live bad day → Genuine passes → edited fails</w:t>
+        <w:t>Normal trip film → Live bad day → Phase vs Hedera → Pack seal → Genuine PDF passes / edited fails</w:t>
       </w:r>
     </w:p>
     <w:p>
@@ -7294,7 +7294,7 @@
           </w:tcPr>
           <w:p>
             <w:pPr>
-              <w:spacing w:after="40"/>
+              <w:spacing w:after="20" w:before="0"/>
             </w:pPr>
             <w:r>
               <w:rPr>
@@ -7328,7 +7328,7 @@
           </w:tcPr>
           <w:p>
             <w:pPr>
-              <w:spacing w:after="40"/>
+              <w:spacing w:after="20" w:before="0"/>
             </w:pPr>
             <w:r>
               <w:rPr>
@@ -7362,7 +7362,7 @@
           </w:tcPr>
           <w:p>
             <w:pPr>
-              <w:spacing w:after="40"/>
+              <w:spacing w:after="20" w:before="0"/>
             </w:pPr>
             <w:r>
               <w:rPr>
@@ -7396,7 +7396,7 @@
           </w:tcPr>
           <w:p>
             <w:pPr>
-              <w:spacing w:after="40"/>
+              <w:spacing w:after="20" w:before="0"/>
             </w:pPr>
             <w:r>
               <w:rPr>
@@ -7430,7 +7430,7 @@
           </w:tcPr>
           <w:p>
             <w:pPr>
-              <w:spacing w:after="40"/>
+              <w:spacing w:after="20" w:before="0"/>
             </w:pPr>
             <w:r>
               <w:rPr>
@@ -7464,7 +7464,7 @@
           </w:tcPr>
           <w:p>
             <w:pPr>
-              <w:spacing w:after="40"/>
+              <w:spacing w:after="20" w:before="0"/>
             </w:pPr>
             <w:r>
               <w:rPr>
@@ -7503,7 +7503,7 @@
           </w:tcPr>
           <w:p>
             <w:pPr>
-              <w:spacing w:after="40"/>
+              <w:spacing w:after="20" w:before="0"/>
             </w:pPr>
             <w:r>
               <w:rPr>
@@ -7535,7 +7535,7 @@
           </w:tcPr>
           <w:p>
             <w:pPr>
-              <w:spacing w:after="40"/>
+              <w:spacing w:after="20" w:before="0"/>
             </w:pPr>
             <w:r>
               <w:rPr>
@@ -7567,7 +7567,7 @@
           </w:tcPr>
           <w:p>
             <w:pPr>
-              <w:spacing w:after="40"/>
+              <w:spacing w:after="20" w:before="0"/>
             </w:pPr>
             <w:r>
               <w:rPr>
@@ -7599,7 +7599,7 @@
           </w:tcPr>
           <w:p>
             <w:pPr>
-              <w:spacing w:after="40"/>
+              <w:spacing w:after="20" w:before="0"/>
             </w:pPr>
             <w:r>
               <w:rPr>
@@ -7631,7 +7631,7 @@
           </w:tcPr>
           <w:p>
             <w:pPr>
-              <w:spacing w:after="40"/>
+              <w:spacing w:after="20" w:before="0"/>
             </w:pPr>
             <w:r>
               <w:rPr>
@@ -7663,7 +7663,7 @@
           </w:tcPr>
           <w:p>
             <w:pPr>
-              <w:spacing w:after="40"/>
+              <w:spacing w:after="20" w:before="0"/>
             </w:pPr>
             <w:r>
               <w:rPr>
@@ -7701,7 +7701,7 @@
           </w:tcPr>
           <w:p>
             <w:pPr>
-              <w:spacing w:after="40"/>
+              <w:spacing w:after="20" w:before="0"/>
             </w:pPr>
             <w:r>
               <w:rPr>
@@ -7733,7 +7733,7 @@
           </w:tcPr>
           <w:p>
             <w:pPr>
-              <w:spacing w:after="40"/>
+              <w:spacing w:after="20" w:before="0"/>
             </w:pPr>
             <w:r>
               <w:rPr>
@@ -7765,7 +7765,7 @@
           </w:tcPr>
           <w:p>
             <w:pPr>
-              <w:spacing w:after="40"/>
+              <w:spacing w:after="20" w:before="0"/>
             </w:pPr>
             <w:r>
               <w:rPr>
@@ -7797,7 +7797,7 @@
           </w:tcPr>
           <w:p>
             <w:pPr>
-              <w:spacing w:after="40"/>
+              <w:spacing w:after="20" w:before="0"/>
             </w:pPr>
             <w:r>
               <w:rPr>
@@ -7829,7 +7829,7 @@
           </w:tcPr>
           <w:p>
             <w:pPr>
-              <w:spacing w:after="40"/>
+              <w:spacing w:after="20" w:before="0"/>
             </w:pPr>
             <w:r>
               <w:rPr>
@@ -7861,7 +7861,7 @@
           </w:tcPr>
           <w:p>
             <w:pPr>
-              <w:spacing w:after="40"/>
+              <w:spacing w:after="20" w:before="0"/>
             </w:pPr>
             <w:r>
               <w:rPr>
@@ -7899,7 +7899,7 @@
           </w:tcPr>
           <w:p>
             <w:pPr>
-              <w:spacing w:after="40"/>
+              <w:spacing w:after="20" w:before="0"/>
             </w:pPr>
             <w:r>
               <w:rPr>
@@ -7931,7 +7931,7 @@
           </w:tcPr>
           <w:p>
             <w:pPr>
-              <w:spacing w:after="40"/>
+              <w:spacing w:after="20" w:before="0"/>
             </w:pPr>
             <w:r>
               <w:rPr>
@@ -7963,7 +7963,7 @@
           </w:tcPr>
           <w:p>
             <w:pPr>
-              <w:spacing w:after="40"/>
+              <w:spacing w:after="20" w:before="0"/>
             </w:pPr>
             <w:r>
               <w:rPr>
@@ -7995,7 +7995,7 @@
           </w:tcPr>
           <w:p>
             <w:pPr>
-              <w:spacing w:after="40"/>
+              <w:spacing w:after="20" w:before="0"/>
             </w:pPr>
             <w:r>
               <w:rPr>
@@ -8027,7 +8027,7 @@
           </w:tcPr>
           <w:p>
             <w:pPr>
-              <w:spacing w:after="40"/>
+              <w:spacing w:after="20" w:before="0"/>
             </w:pPr>
             <w:r>
               <w:rPr>
@@ -8059,7 +8059,7 @@
           </w:tcPr>
           <w:p>
             <w:pPr>
-              <w:spacing w:after="40"/>
+              <w:spacing w:after="20" w:before="0"/>
             </w:pPr>
             <w:r>
               <w:rPr>
@@ -8097,7 +8097,7 @@
           </w:tcPr>
           <w:p>
             <w:pPr>
-              <w:spacing w:after="40"/>
+              <w:spacing w:after="20" w:before="0"/>
             </w:pPr>
             <w:r>
               <w:rPr>
@@ -8129,7 +8129,7 @@
           </w:tcPr>
           <w:p>
             <w:pPr>
-              <w:spacing w:after="40"/>
+              <w:spacing w:after="20" w:before="0"/>
             </w:pPr>
             <w:r>
               <w:rPr>
@@ -8161,7 +8161,7 @@
           </w:tcPr>
           <w:p>
             <w:pPr>
-              <w:spacing w:after="40"/>
+              <w:spacing w:after="20" w:before="0"/>
             </w:pPr>
             <w:r>
               <w:rPr>
@@ -8193,7 +8193,7 @@
           </w:tcPr>
           <w:p>
             <w:pPr>
-              <w:spacing w:after="40"/>
+              <w:spacing w:after="20" w:before="0"/>
             </w:pPr>
             <w:r>
               <w:rPr>
@@ -8225,7 +8225,7 @@
           </w:tcPr>
           <w:p>
             <w:pPr>
-              <w:spacing w:after="40"/>
+              <w:spacing w:after="20" w:before="0"/>
             </w:pPr>
             <w:r>
               <w:rPr>
@@ -8257,7 +8257,7 @@
           </w:tcPr>
           <w:p>
             <w:pPr>
-              <w:spacing w:after="40"/>
+              <w:spacing w:after="20" w:before="0"/>
             </w:pPr>
             <w:r>
               <w:rPr>
@@ -8295,7 +8295,7 @@
           </w:tcPr>
           <w:p>
             <w:pPr>
-              <w:spacing w:after="40"/>
+              <w:spacing w:after="20" w:before="0"/>
             </w:pPr>
             <w:r>
               <w:rPr>
@@ -8327,7 +8327,7 @@
           </w:tcPr>
           <w:p>
             <w:pPr>
-              <w:spacing w:after="40"/>
+              <w:spacing w:after="20" w:before="0"/>
             </w:pPr>
             <w:r>
               <w:rPr>
@@ -8359,7 +8359,7 @@
           </w:tcPr>
           <w:p>
             <w:pPr>
-              <w:spacing w:after="40"/>
+              <w:spacing w:after="20" w:before="0"/>
             </w:pPr>
             <w:r>
               <w:rPr>
@@ -8391,7 +8391,7 @@
           </w:tcPr>
           <w:p>
             <w:pPr>
-              <w:spacing w:after="40"/>
+              <w:spacing w:after="20" w:before="0"/>
             </w:pPr>
             <w:r>
               <w:rPr>
@@ -8423,7 +8423,7 @@
           </w:tcPr>
           <w:p>
             <w:pPr>
-              <w:spacing w:after="40"/>
+              <w:spacing w:after="20" w:before="0"/>
             </w:pPr>
             <w:r>
               <w:rPr>
@@ -8455,7 +8455,7 @@
           </w:tcPr>
           <w:p>
             <w:pPr>
-              <w:spacing w:after="40"/>
+              <w:spacing w:after="20" w:before="0"/>
             </w:pPr>
             <w:r>
               <w:rPr>
@@ -8493,7 +8493,7 @@
           </w:tcPr>
           <w:p>
             <w:pPr>
-              <w:spacing w:after="40"/>
+              <w:spacing w:after="20" w:before="0"/>
             </w:pPr>
             <w:r>
               <w:rPr>
@@ -8525,7 +8525,7 @@
           </w:tcPr>
           <w:p>
             <w:pPr>
-              <w:spacing w:after="40"/>
+              <w:spacing w:after="20" w:before="0"/>
             </w:pPr>
             <w:r>
               <w:rPr>
@@ -8557,7 +8557,7 @@
           </w:tcPr>
           <w:p>
             <w:pPr>
-              <w:spacing w:after="40"/>
+              <w:spacing w:after="20" w:before="0"/>
             </w:pPr>
             <w:r>
               <w:rPr>
@@ -8589,7 +8589,7 @@
           </w:tcPr>
           <w:p>
             <w:pPr>
-              <w:spacing w:after="40"/>
+              <w:spacing w:after="20" w:before="0"/>
             </w:pPr>
             <w:r>
               <w:rPr>
@@ -8621,7 +8621,7 @@
           </w:tcPr>
           <w:p>
             <w:pPr>
-              <w:spacing w:after="40"/>
+              <w:spacing w:after="20" w:before="0"/>
             </w:pPr>
             <w:r>
               <w:rPr>
@@ -8653,7 +8653,7 @@
           </w:tcPr>
           <w:p>
             <w:pPr>
-              <w:spacing w:after="40"/>
+              <w:spacing w:after="20" w:before="0"/>
             </w:pPr>
             <w:r>
               <w:rPr>
@@ -8691,7 +8691,7 @@
           </w:tcPr>
           <w:p>
             <w:pPr>
-              <w:spacing w:after="40"/>
+              <w:spacing w:after="20" w:before="0"/>
             </w:pPr>
             <w:r>
               <w:rPr>
@@ -8723,7 +8723,7 @@
           </w:tcPr>
           <w:p>
             <w:pPr>
-              <w:spacing w:after="40"/>
+              <w:spacing w:after="20" w:before="0"/>
             </w:pPr>
             <w:r>
               <w:rPr>
@@ -8755,7 +8755,7 @@
           </w:tcPr>
           <w:p>
             <w:pPr>
-              <w:spacing w:after="40"/>
+              <w:spacing w:after="20" w:before="0"/>
             </w:pPr>
             <w:r>
               <w:rPr>
@@ -8787,7 +8787,7 @@
           </w:tcPr>
           <w:p>
             <w:pPr>
-              <w:spacing w:after="40"/>
+              <w:spacing w:after="20" w:before="0"/>
             </w:pPr>
             <w:r>
               <w:rPr>
@@ -8819,7 +8819,7 @@
           </w:tcPr>
           <w:p>
             <w:pPr>
-              <w:spacing w:after="40"/>
+              <w:spacing w:after="20" w:before="0"/>
             </w:pPr>
             <w:r>
               <w:rPr>
@@ -8851,7 +8851,7 @@
           </w:tcPr>
           <w:p>
             <w:pPr>
-              <w:spacing w:after="40"/>
+              <w:spacing w:after="20" w:before="0"/>
             </w:pPr>
             <w:r>
               <w:rPr>
@@ -8889,7 +8889,7 @@
           </w:tcPr>
           <w:p>
             <w:pPr>
-              <w:spacing w:after="40"/>
+              <w:spacing w:after="20" w:before="0"/>
             </w:pPr>
             <w:r>
               <w:rPr>
@@ -8921,7 +8921,7 @@
           </w:tcPr>
           <w:p>
             <w:pPr>
-              <w:spacing w:after="40"/>
+              <w:spacing w:after="20" w:before="0"/>
             </w:pPr>
             <w:r>
               <w:rPr>
@@ -8953,7 +8953,7 @@
           </w:tcPr>
           <w:p>
             <w:pPr>
-              <w:spacing w:after="40"/>
+              <w:spacing w:after="20" w:before="0"/>
             </w:pPr>
             <w:r>
               <w:rPr>
@@ -8985,7 +8985,7 @@
           </w:tcPr>
           <w:p>
             <w:pPr>
-              <w:spacing w:after="40"/>
+              <w:spacing w:after="20" w:before="0"/>
             </w:pPr>
             <w:r>
               <w:rPr>
@@ -9017,7 +9017,7 @@
           </w:tcPr>
           <w:p>
             <w:pPr>
-              <w:spacing w:after="40"/>
+              <w:spacing w:after="20" w:before="0"/>
             </w:pPr>
             <w:r>
               <w:rPr>
@@ -9049,7 +9049,7 @@
           </w:tcPr>
           <w:p>
             <w:pPr>
-              <w:spacing w:after="40"/>
+              <w:spacing w:after="20" w:before="0"/>
             </w:pPr>
             <w:r>
               <w:rPr>
@@ -9087,7 +9087,7 @@
           </w:tcPr>
           <w:p>
             <w:pPr>
-              <w:spacing w:after="40"/>
+              <w:spacing w:after="20" w:before="0"/>
             </w:pPr>
             <w:r>
               <w:rPr>
@@ -9097,7 +9097,7 @@
                 <w:sz w:val="16"/>
                 <w:szCs w:val="16"/>
               </w:rPr>
-              <w:t>7. Insurer verifies</w:t>
+              <w:t>7. Phase verified</w:t>
             </w:r>
           </w:p>
         </w:tc>
@@ -9119,7 +9119,7 @@
           </w:tcPr>
           <w:p>
             <w:pPr>
-              <w:spacing w:after="40"/>
+              <w:spacing w:after="20" w:before="0"/>
             </w:pPr>
             <w:r>
               <w:rPr>
@@ -9151,7 +9151,7 @@
           </w:tcPr>
           <w:p>
             <w:pPr>
-              <w:spacing w:after="40"/>
+              <w:spacing w:after="20" w:before="0"/>
             </w:pPr>
             <w:r>
               <w:rPr>
@@ -9161,7 +9161,7 @@
                 <w:sz w:val="16"/>
                 <w:szCs w:val="16"/>
               </w:rPr>
-              <w:t>Issue an audit pack; open the link on the insurer phone; enter the e-mailed code; timeline, map, photos, anchored versus recorded only, missing evidence listed; Verify checks Hedera.</w:t>
+              <w:t>Issue the pack; open it on the insurer phone with the e-mailed code. Select a successfully anchored phase. Verify its record against Hedera in the browser and show the timestamp. Say: 'The earlier reference is outside our control.' Distinguish recorded-only items.</w:t>
             </w:r>
           </w:p>
         </w:tc>
@@ -9183,7 +9183,7 @@
           </w:tcPr>
           <w:p>
             <w:pPr>
-              <w:spacing w:after="40"/>
+              <w:spacing w:after="20" w:before="0"/>
             </w:pPr>
             <w:r>
               <w:rPr>
@@ -9215,7 +9215,7 @@
           </w:tcPr>
           <w:p>
             <w:pPr>
-              <w:spacing w:after="40"/>
+              <w:spacing w:after="20" w:before="0"/>
             </w:pPr>
             <w:r>
               <w:rPr>
@@ -9247,7 +9247,7 @@
           </w:tcPr>
           <w:p>
             <w:pPr>
-              <w:spacing w:after="40"/>
+              <w:spacing w:after="20" w:before="0"/>
             </w:pPr>
             <w:r>
               <w:rPr>
@@ -9257,7 +9257,7 @@
                 <w:sz w:val="16"/>
                 <w:szCs w:val="16"/>
               </w:rPr>
-              <w:t xml:space="preserve">Pre-issued pack on a backup link.</w:t>
+              <w:t>Pre-issued pack with anchored phase and verified seal. Mirror unreachable: show rehearsal recording; say live verification is unavailable.</w:t>
             </w:r>
           </w:p>
         </w:tc>
@@ -9285,7 +9285,7 @@
           </w:tcPr>
           <w:p>
             <w:pPr>
-              <w:spacing w:after="40"/>
+              <w:spacing w:after="20" w:before="0"/>
             </w:pPr>
             <w:r>
               <w:rPr>
@@ -9317,7 +9317,7 @@
           </w:tcPr>
           <w:p>
             <w:pPr>
-              <w:spacing w:after="40"/>
+              <w:spacing w:after="20" w:before="0"/>
             </w:pPr>
             <w:r>
               <w:rPr>
@@ -9349,7 +9349,7 @@
           </w:tcPr>
           <w:p>
             <w:pPr>
-              <w:spacing w:after="40"/>
+              <w:spacing w:after="20" w:before="0"/>
             </w:pPr>
             <w:r>
               <w:rPr>
@@ -9359,7 +9359,7 @@
                 <w:sz w:val="16"/>
                 <w:szCs w:val="16"/>
               </w:rPr>
-              <w:t>In the portal's "Is my PDF genuine?" check, upload the real audit-pack PDF: it passes. Upload the edited copy prepared in rehearsal: it fails. Never edit the database live.</w:t>
+              <w:t>Show the pack seal verified on Hedera. In 'Is my PDF genuine?', choose original PDF: matches. Choose edited PDF: differs. Files stay in the browser. Say: 'The exact issued copy is proven, not the truth of every statement.'</w:t>
             </w:r>
           </w:p>
         </w:tc>
@@ -9381,7 +9381,7 @@
           </w:tcPr>
           <w:p>
             <w:pPr>
-              <w:spacing w:after="40"/>
+              <w:spacing w:after="20" w:before="0"/>
             </w:pPr>
             <w:r>
               <w:rPr>
@@ -9413,7 +9413,7 @@
           </w:tcPr>
           <w:p>
             <w:pPr>
-              <w:spacing w:after="40"/>
+              <w:spacing w:after="20" w:before="0"/>
             </w:pPr>
             <w:r>
               <w:rPr>
@@ -9445,7 +9445,7 @@
           </w:tcPr>
           <w:p>
             <w:pPr>
-              <w:spacing w:after="40"/>
+              <w:spacing w:after="20" w:before="0"/>
             </w:pPr>
             <w:r>
               <w:rPr>
@@ -9483,7 +9483,7 @@
           </w:tcPr>
           <w:p>
             <w:pPr>
-              <w:spacing w:after="40"/>
+              <w:spacing w:after="20" w:before="0"/>
             </w:pPr>
             <w:r>
               <w:rPr>
@@ -9515,7 +9515,7 @@
           </w:tcPr>
           <w:p>
             <w:pPr>
-              <w:spacing w:after="40"/>
+              <w:spacing w:after="20" w:before="0"/>
             </w:pPr>
             <w:r>
               <w:rPr>
@@ -9547,7 +9547,7 @@
           </w:tcPr>
           <w:p>
             <w:pPr>
-              <w:spacing w:after="40"/>
+              <w:spacing w:after="20" w:before="0"/>
             </w:pPr>
             <w:r>
               <w:rPr>
@@ -9557,7 +9557,7 @@
                 <w:sz w:val="16"/>
                 <w:szCs w:val="16"/>
               </w:rPr>
-              <w:t xml:space="preserve">An insurer can now retrieve this. It still can't get camera footage, gate records or live Pulsit positions.</w:t>
+              <w:t>Two checks: the anchored phase and the exact pack issued, against Hedera. Recorded-only items stay labelled. Camera footage, gate records and live Pulsit positions are not included.</w:t>
             </w:r>
           </w:p>
         </w:tc>
@@ -9579,7 +9579,7 @@
           </w:tcPr>
           <w:p>
             <w:pPr>
-              <w:spacing w:after="40"/>
+              <w:spacing w:after="20" w:before="0"/>
             </w:pPr>
             <w:r>
               <w:rPr>
@@ -9611,7 +9611,7 @@
           </w:tcPr>
           <w:p>
             <w:pPr>
-              <w:spacing w:after="40"/>
+              <w:spacing w:after="20" w:before="0"/>
             </w:pPr>
             <w:r>
               <w:rPr>
@@ -9643,7 +9643,7 @@
           </w:tcPr>
           <w:p>
             <w:pPr>
-              <w:spacing w:after="40"/>
+              <w:spacing w:after="20" w:before="0"/>
             </w:pPr>
             <w:r>
               <w:rPr>
@@ -9681,7 +9681,7 @@
           </w:tcPr>
           <w:p>
             <w:pPr>
-              <w:spacing w:after="40"/>
+              <w:spacing w:after="20" w:before="0"/>
             </w:pPr>
             <w:r>
               <w:rPr>
@@ -9713,7 +9713,7 @@
           </w:tcPr>
           <w:p>
             <w:pPr>
-              <w:spacing w:after="40"/>
+              <w:spacing w:after="20" w:before="0"/>
             </w:pPr>
             <w:r>
               <w:rPr>
@@ -9745,7 +9745,7 @@
           </w:tcPr>
           <w:p>
             <w:pPr>
-              <w:spacing w:after="40"/>
+              <w:spacing w:after="20" w:before="0"/>
             </w:pPr>
             <w:r>
               <w:rPr>
@@ -9777,7 +9777,7 @@
           </w:tcPr>
           <w:p>
             <w:pPr>
-              <w:spacing w:after="40"/>
+              <w:spacing w:after="20" w:before="0"/>
             </w:pPr>
             <w:r>
               <w:rPr>
@@ -9809,7 +9809,7 @@
           </w:tcPr>
           <w:p>
             <w:pPr>
-              <w:spacing w:after="40"/>
+              <w:spacing w:after="20" w:before="0"/>
             </w:pPr>
             <w:r>
               <w:rPr>
@@ -9841,7 +9841,7 @@
           </w:tcPr>
           <w:p>
             <w:pPr>
-              <w:spacing w:after="40"/>
+              <w:spacing w:after="20" w:before="0"/>
             </w:pPr>
             <w:r>
               <w:rPr>
@@ -9879,7 +9879,7 @@
           </w:tcPr>
           <w:p>
             <w:pPr>
-              <w:spacing w:after="40"/>
+              <w:spacing w:after="20" w:before="0"/>
             </w:pPr>
             <w:r>
               <w:rPr>
@@ -9911,7 +9911,7 @@
           </w:tcPr>
           <w:p>
             <w:pPr>
-              <w:spacing w:after="40"/>
+              <w:spacing w:after="20" w:before="0"/>
             </w:pPr>
             <w:r>
               <w:rPr>
@@ -9943,7 +9943,7 @@
           </w:tcPr>
           <w:p>
             <w:pPr>
-              <w:spacing w:after="40"/>
+              <w:spacing w:after="20" w:before="0"/>
             </w:pPr>
             <w:r>
               <w:rPr>
@@ -9975,7 +9975,7 @@
           </w:tcPr>
           <w:p>
             <w:pPr>
-              <w:spacing w:after="40"/>
+              <w:spacing w:after="20" w:before="0"/>
             </w:pPr>
             <w:r>
               <w:rPr>
@@ -10007,7 +10007,7 @@
           </w:tcPr>
           <w:p>
             <w:pPr>
-              <w:spacing w:after="40"/>
+              <w:spacing w:after="20" w:before="0"/>
             </w:pPr>
             <w:r>
               <w:rPr>
@@ -10039,7 +10039,7 @@
           </w:tcPr>
           <w:p>
             <w:pPr>
-              <w:spacing w:after="40"/>
+              <w:spacing w:after="20" w:before="0"/>
             </w:pPr>
             <w:r>
               <w:rPr>
@@ -10067,7 +10067,7 @@
           <w:sz w:val="18"/>
           <w:szCs w:val="18"/>
         </w:rPr>
-        <w:t>Before the slot: Railway worker and beat running (or receipts stay owed) · portal.freightproof.co.za verifies a pack end to end · SendGrid code arrives within a minute · Didit callback reaches the hosted API · DEV_PANEL_ENABLED on (others only if their scene is shown; panel off afterwards) · demo data seeded · edited copy of the audit-pack PDF ready on the insurer phone · video file and fallback clips on laptop A, offline.</w:t>
+        <w:t>Before the slot: worker and beat running; phase and pack seal verified; SendGrid and Didit callbacks checked; demo panel on and data seeded; original and edited PDFs ready; video and fallbacks saved offline. Switch the demo panel off afterwards.</w:t>
       </w:r>
     </w:p>
     <w:p>
@@ -10409,7 +10409,7 @@
                 <w:sz w:val="20"/>
                 <w:szCs w:val="20"/>
               </w:rPr>
-              <w:t xml:space="preserve">An audit pack: a frozen PDF and web page, each item marked anchored or recorded only, missing evidence listed, verifiable in their own browser against Hedera. Not included: camera footage, gate records, live tracker data.</w:t>
+              <w:t>A frozen PDF and web pack. The recipient can verify successfully anchored phase records, then the separate seal on the issued report and PDF. Recorded-only and missing evidence remain labelled; the pack seal does not give those items an earlier phase receipt. Camera footage, gate records and live tracker data are not included.</w:t>
             </w:r>
           </w:p>
         </w:tc>
@@ -10785,7 +10785,7 @@
                 <w:sz w:val="20"/>
                 <w:szCs w:val="20"/>
               </w:rPr>
-              <w:t xml:space="preserve">What does anchoring prove?</w:t>
+              <w:t>Why Hedera, and what does anchoring prove?</w:t>
             </w:r>
           </w:p>
         </w:tc>
@@ -10817,7 +10817,7 @@
                 <w:sz w:val="20"/>
                 <w:szCs w:val="20"/>
               </w:rPr>
-              <w:t>It shows that the fingerprinted content existed no later than the Hedera consensus time and lets us detect later changes. It does not establish that the original report was true or identify its author by itself.</w:t>
+              <w:t>An administrator could replace both a record and its fingerprint in our database. Hedera supplies an independently timestamped reference outside our control. The recipient checks anchored phase content and the pack's separate seal against it. This establishes integrity and timing, not original truth. An independent timestamp service is another possible design; Hedera is the one implemented here.</w:t>
             </w:r>
           </w:p>
         </w:tc>

</xml_diff>